<commit_message>
fix(curriculum): correct M2 opening lesson title
</commit_message>
<xml_diff>
--- a/mufredat-docs/planlar/M2_Yillik_Plan.docx
+++ b/mufredat-docs/planlar/M2_Yillik_Plan.docx
@@ -426,7 +426,7 @@
                 <w:color w:val="17365D"/>
                 <w:sz w:val="17"/>
               </w:rPr>
-              <w:t>İki Kilimlik Bir Dükkânda Başlayan Yolculuk</w:t>
+              <w:t>Küçük Bir Terzi Dükkânında Başlayan Yolculuk</w:t>
             </w:r>
           </w:p>
         </w:tc>
@@ -5443,7 +5443,7 @@
         <w:t xml:space="preserve">M2-1 durumu: </w:t>
       </w:r>
       <w:r>
-        <w:t>Hazırlanmış olan “İki Kilimlik Bir Dükkânda Başlayan Yolculuk” dersi bu yıllık plandaki 1. haftanın ayrıntılı ders dosyasıdır.</w:t>
+        <w:t>Hazırlanmış olan “Küçük Bir Terzi Dükkânında Başlayan Yolculuk” dersi bu yıllık plandaki 1. haftanın ayrıntılı ders dosyasıdır.</w:t>
       </w:r>
     </w:p>
     <w:p>

</xml_diff>